<commit_message>
Add Cowles research grant to CV
</commit_message>
<xml_diff>
--- a/assets/Nguyen_Tra_CV.docx
+++ b/assets/Nguyen_Tra_CV.docx
@@ -398,6 +398,40 @@
         <w:gridCol w:w="792"/>
         <w:gridCol w:w="8352"/>
       </w:tblGrid>
+      <w:tr>
+        <w:tc>
+          <w:tcPr>
+            <w:tcW w:w="792" w:type="dxa"/>
+            <w:tcMar>
+              <w:top w:w="0" w:type="dxa"/>
+              <w:left w:w="0" w:type="dxa"/>
+              <w:bottom w:w="0" w:type="dxa"/>
+              <w:right w:w="0" w:type="dxa"/>
+            </w:tcMar>
+          </w:tcPr>
+          <w:p>
+            <w:r>
+              <w:t>2025</w:t>
+            </w:r>
+          </w:p>
+        </w:tc>
+        <w:tc>
+          <w:tcPr>
+            <w:tcW w:w="8352" w:type="dxa"/>
+            <w:tcMar>
+              <w:top w:w="0" w:type="dxa"/>
+              <w:left w:w="0" w:type="dxa"/>
+              <w:bottom w:w="0" w:type="dxa"/>
+              <w:right w:w="0" w:type="dxa"/>
+            </w:tcMar>
+          </w:tcPr>
+          <w:p>
+            <w:r>
+              <w:t>Cowles Foundation Research Grant, $30,000</w:t>
+            </w:r>
+          </w:p>
+        </w:tc>
+      </w:tr>
       <w:tr>
         <w:tc>
           <w:tcPr>

</xml_diff>

<commit_message>
Restore Cowles grant in CV
</commit_message>
<xml_diff>
--- a/assets/Nguyen_Tra_CV.docx
+++ b/assets/Nguyen_Tra_CV.docx
@@ -464,6 +464,8 @@
               <w:t>Robin E. Evenson Fund, Economic Growth Center, $2,500 USD</w:t>
             </w:r>
           </w:p>
+          <w:p/>
+          <w:p/>
         </w:tc>
       </w:tr>
     </w:tbl>
@@ -763,7 +765,23 @@
         <w:ind w:left="792"/>
       </w:pPr>
       <w:r>
-        <w:t>“Perceived Education Returns Abroad and Investment at Home,” with Emma Naslund-Hadley, Siu Yuat Wong, and Qianyao Ye, November 2026.</w:t>
+        <w:t xml:space="preserve">“Perceived Education Returns Abroad and Investment at Home,” with Emma Naslund-Hadley, Siu </w:t>
+      </w:r>
+      <w:proofErr w:type="spellStart"/>
+      <w:r>
+        <w:t>Yuat</w:t>
+      </w:r>
+      <w:proofErr w:type="spellEnd"/>
+      <w:r>
+        <w:t xml:space="preserve"> Wong, and </w:t>
+      </w:r>
+      <w:proofErr w:type="spellStart"/>
+      <w:r>
+        <w:t>Qianyao</w:t>
+      </w:r>
+      <w:proofErr w:type="spellEnd"/>
+      <w:r>
+        <w:t xml:space="preserve"> Ye, November 2026.</w:t>
       </w:r>
     </w:p>
     <w:p>
@@ -1082,7 +1100,15 @@
         <w:spacing w:after="120"/>
       </w:pPr>
       <w:r>
-        <w:t>This paper fills the gap by estimating the causal effect of local workforce age composition on firms’ adoption of newly released software technologies, instrumenting the local old-worker share with a Bartik-style measure constructed from historical commuting-zone age composition and national survival rates. We use Lightcast job postings to track local employer demand for 15 newly released software technologies between 2012 and 2016, each matched to an older technology used for similar tasks. Technology adoption is measured by employer demand for frontier software skills, and workforce age composition is measured by the local share of college-educated workers ages 50 to 69.</w:t>
+        <w:t xml:space="preserve">This paper fills the gap by estimating the causal effect of local workforce age composition on firms’ adoption of newly released software technologies, instrumenting the local old-worker share with a Bartik-style measure constructed from historical commuting-zone age composition and national survival rates. We use </w:t>
+      </w:r>
+      <w:proofErr w:type="spellStart"/>
+      <w:r>
+        <w:t>Lightcast</w:t>
+      </w:r>
+      <w:proofErr w:type="spellEnd"/>
+      <w:r>
+        <w:t xml:space="preserve"> job postings to track local employer demand for 15 newly released software technologies between 2012 and 2016, each matched to an older technology used for similar tasks. Technology adoption is measured by employer demand for frontier software skills, and workforce age composition is measured by the local share of college-educated workers ages 50 to 69.</w:t>
       </w:r>
     </w:p>
     <w:p>
@@ -1124,7 +1150,35 @@
         <w:rPr>
           <w:sz w:val="22"/>
         </w:rPr>
-        <w:t>” with Emma Naslund-Hadley, Siu Yuat Wong, and Qianyao Ye [</w:t>
+        <w:t xml:space="preserve">” with Emma Naslund-Hadley, Siu </w:t>
+      </w:r>
+      <w:proofErr w:type="spellStart"/>
+      <w:r>
+        <w:rPr>
+          <w:sz w:val="22"/>
+        </w:rPr>
+        <w:t>Yuat</w:t>
+      </w:r>
+      <w:proofErr w:type="spellEnd"/>
+      <w:r>
+        <w:rPr>
+          <w:sz w:val="22"/>
+        </w:rPr>
+        <w:t xml:space="preserve"> Wong, and </w:t>
+      </w:r>
+      <w:proofErr w:type="spellStart"/>
+      <w:r>
+        <w:rPr>
+          <w:sz w:val="22"/>
+        </w:rPr>
+        <w:t>Qianyao</w:t>
+      </w:r>
+      <w:proofErr w:type="spellEnd"/>
+      <w:r>
+        <w:rPr>
+          <w:sz w:val="22"/>
+        </w:rPr>
+        <w:t xml:space="preserve"> Ye [</w:t>
       </w:r>
       <w:r>
         <w:rPr>
@@ -2142,21 +2196,6 @@
 </file>
 
 <file path=customXml/item1.xml><?xml version="1.0" encoding="utf-8"?>
-<p:properties xmlns:p="http://schemas.microsoft.com/office/2006/metadata/properties" xmlns:xsi="http://www.w3.org/2001/XMLSchema-instance" xmlns:pc="http://schemas.microsoft.com/office/infopath/2007/PartnerControls">
-  <documentManagement/>
-</p:properties>
-</file>
-
-<file path=customXml/item2.xml><?xml version="1.0" encoding="utf-8"?>
-<?mso-contentType ?>
-<FormTemplates xmlns="http://schemas.microsoft.com/sharepoint/v3/contenttype/forms">
-  <Display>DocumentLibraryForm</Display>
-  <Edit>DocumentLibraryForm</Edit>
-  <New>DocumentLibraryForm</New>
-</FormTemplates>
-</file>
-
-<file path=customXml/item3.xml><?xml version="1.0" encoding="utf-8"?>
 <ct:contentTypeSchema xmlns:ct="http://schemas.microsoft.com/office/2006/metadata/contentType" xmlns:ma="http://schemas.microsoft.com/office/2006/metadata/properties/metaAttributes" ct:_="" ma:_="" ma:contentTypeName="Document" ma:contentTypeID="0x01010007FC644F770EBB4593783ED8D49DD1E9" ma:contentTypeVersion="0" ma:contentTypeDescription="Create a new document." ma:contentTypeScope="" ma:versionID="3080d9b11825addb7e1a7356b8c375ef">
   <xsd:schema xmlns:xsd="http://www.w3.org/2001/XMLSchema" xmlns:xs="http://www.w3.org/2001/XMLSchema" xmlns:p="http://schemas.microsoft.com/office/2006/metadata/properties" targetNamespace="http://schemas.microsoft.com/office/2006/metadata/properties" ma:root="true" ma:fieldsID="500c6692915ba10984c0aabd49f31b22">
     <xsd:element name="properties">
@@ -2270,10 +2309,32 @@
 </ct:contentTypeSchema>
 </file>
 
+<file path=customXml/item2.xml><?xml version="1.0" encoding="utf-8"?>
+<?mso-contentType ?>
+<FormTemplates xmlns="http://schemas.microsoft.com/sharepoint/v3/contenttype/forms">
+  <Display>DocumentLibraryForm</Display>
+  <Edit>DocumentLibraryForm</Edit>
+  <New>DocumentLibraryForm</New>
+</FormTemplates>
+</file>
+
+<file path=customXml/item3.xml><?xml version="1.0" encoding="utf-8"?>
+<p:properties xmlns:p="http://schemas.microsoft.com/office/2006/metadata/properties" xmlns:xsi="http://www.w3.org/2001/XMLSchema-instance" xmlns:pc="http://schemas.microsoft.com/office/infopath/2007/PartnerControls">
+  <documentManagement/>
+</p:properties>
+</file>
+
 <file path=customXml/itemProps1.xml><?xml version="1.0" encoding="utf-8"?>
-<ds:datastoreItem xmlns:ds="http://schemas.openxmlformats.org/officeDocument/2006/customXml" ds:itemID="{D0124FFD-1CE1-4B77-84DE-59500854D475}">
+<ds:datastoreItem xmlns:ds="http://schemas.openxmlformats.org/officeDocument/2006/customXml" ds:itemID="{B636C937-F529-4C3E-AE48-ABCDC19C7117}">
   <ds:schemaRefs>
+    <ds:schemaRef ds:uri="http://schemas.microsoft.com/office/2006/metadata/contentType"/>
+    <ds:schemaRef ds:uri="http://schemas.microsoft.com/office/2006/metadata/properties/metaAttributes"/>
+    <ds:schemaRef ds:uri="http://www.w3.org/2001/XMLSchema"/>
     <ds:schemaRef ds:uri="http://schemas.microsoft.com/office/2006/metadata/properties"/>
+    <ds:schemaRef ds:uri="http://schemas.openxmlformats.org/package/2006/metadata/core-properties"/>
+    <ds:schemaRef ds:uri="http://purl.org/dc/elements/1.1/"/>
+    <ds:schemaRef ds:uri="http://purl.org/dc/terms/"/>
+    <ds:schemaRef ds:uri="http://schemas.microsoft.com/internal/obd"/>
     <ds:schemaRef ds:uri="http://schemas.microsoft.com/office/infopath/2007/PartnerControls"/>
   </ds:schemaRefs>
 </ds:datastoreItem>
@@ -2288,16 +2349,9 @@
 </file>
 
 <file path=customXml/itemProps3.xml><?xml version="1.0" encoding="utf-8"?>
-<ds:datastoreItem xmlns:ds="http://schemas.openxmlformats.org/officeDocument/2006/customXml" ds:itemID="{B636C937-F529-4C3E-AE48-ABCDC19C7117}">
+<ds:datastoreItem xmlns:ds="http://schemas.openxmlformats.org/officeDocument/2006/customXml" ds:itemID="{D0124FFD-1CE1-4B77-84DE-59500854D475}">
   <ds:schemaRefs>
-    <ds:schemaRef ds:uri="http://schemas.microsoft.com/office/2006/metadata/contentType"/>
-    <ds:schemaRef ds:uri="http://schemas.microsoft.com/office/2006/metadata/properties/metaAttributes"/>
-    <ds:schemaRef ds:uri="http://www.w3.org/2001/XMLSchema"/>
     <ds:schemaRef ds:uri="http://schemas.microsoft.com/office/2006/metadata/properties"/>
-    <ds:schemaRef ds:uri="http://schemas.openxmlformats.org/package/2006/metadata/core-properties"/>
-    <ds:schemaRef ds:uri="http://purl.org/dc/elements/1.1/"/>
-    <ds:schemaRef ds:uri="http://purl.org/dc/terms/"/>
-    <ds:schemaRef ds:uri="http://schemas.microsoft.com/internal/obd"/>
     <ds:schemaRef ds:uri="http://schemas.microsoft.com/office/infopath/2007/PartnerControls"/>
   </ds:schemaRefs>
 </ds:datastoreItem>

</xml_diff>

<commit_message>
Update job market paper abstract
</commit_message>
<xml_diff>
--- a/assets/Nguyen_Tra_CV.docx
+++ b/assets/Nguyen_Tra_CV.docx
@@ -1100,15 +1100,7 @@
         <w:spacing w:after="120"/>
       </w:pPr>
       <w:r>
-        <w:t xml:space="preserve">This paper fills the gap by estimating the causal effect of local workforce age composition on firms’ adoption of newly released software technologies, instrumenting the local old-worker share with a Bartik-style measure constructed from historical commuting-zone age composition and national survival rates. We use </w:t>
-      </w:r>
-      <w:proofErr w:type="spellStart"/>
-      <w:r>
-        <w:t>Lightcast</w:t>
-      </w:r>
-      <w:proofErr w:type="spellEnd"/>
-      <w:r>
-        <w:t xml:space="preserve"> job postings to track local employer demand for 15 newly released software technologies between 2012 and 2016, each matched to an older technology used for similar tasks. Technology adoption is measured by employer demand for frontier software skills, and workforce age composition is measured by the local share of college-educated workers ages 50 to 69.</w:t>
+        <w:t>This paper fills this gap by estimating the causal effect of local workforce age composition on firms’ adoption of newly released software technologies, instrumenting the local old-worker share with a Bartik-style measure constructed from historical commuting-zone age composition and national survival rates while allowing for a rich set of controls. We use Lightcast job postings to track local employer demand for 15 newly released software technologies between 2012 and 2016, each matched to an older technology used for similar tasks. Technology adoption is measured by employer demand for frontier software skills, and workforce age composition is measured by the local share of college-educated workers ages 50 to 69.</w:t>
       </w:r>
     </w:p>
     <w:p>
@@ -1116,7 +1108,7 @@
         <w:spacing w:after="120"/>
       </w:pPr>
       <w:r>
-        <w:t>The empirical results show that, within five years of release, employers in older labor markets post increasingly fewer vacancies requiring the newest software technologies. Moreover, the estimates indicate that the age-related adoption gap is larger when the new software is more difficult to master, consistent with older workers facing higher effective retraining costs because learning time has a higher opportunity cost late in the career and shorter remaining horizons make the same learning investment less attractive.</w:t>
+        <w:t>The empirical results show that, within five years of release, employers in older labor markets post increasingly fewer vacancies requiring the newest software technologies. Moreover, the estimates indicate that the age-related adoption gap is larger when the new software is more difficult to master.</w:t>
       </w:r>
     </w:p>
     <w:p>
@@ -1124,7 +1116,7 @@
         <w:spacing w:after="120"/>
       </w:pPr>
       <w:r>
-        <w:t>To explain the adoption gap and evaluate policy counterfactuals, we develop and calibrate a simple model linking workers’ retraining decisions to firms’ demand for frontier-technology skills. The key mechanism is finite-horizon retraining: because older workers have shorter remaining careers, they have less time to recover learning costs, making the same skill investment less attractive late in the career. The calibrated model shows that policy margins changing workforce age structure can have different implications for technology adoption. Aging caused by weak inflows of young workers, as under low fertility or low migration, slows adoption by reducing the share of workers with long retraining horizons. By contrast, longer expected working lives, as under delayed retirement, can mitigate this force by increasing older workers’ return to skill investment.</w:t>
+        <w:t>To explain our empirical findings and evaluate policy counterfactuals, we develop and calibrate a simple model linking workers’ retraining decisions to firms’ demand for frontier-technology skills. The key mechanism is finite-horizon retraining: because older workers have shorter remaining careers, they have less time to recover learning costs, making the same skill investment less attractive late in the career. The calibrated model shows that policy margins changing workforce age structure can have different implications for technology adoption. Aging caused by weak inflows of young workers, as under low fertility or low migration, slows adoption by reducing the share of workers with long retraining horizons. By contrast, longer expected working lives, as under delayed retirement, can mitigate this force by increasing older workers’ return to skill investment.</w:t>
       </w:r>
     </w:p>
     <w:p>

</xml_diff>

<commit_message>
Address initial CV comments
</commit_message>
<xml_diff>
--- a/assets/Nguyen_Tra_CV.docx
+++ b/assets/Nguyen_Tra_CV.docx
@@ -1,6 +1,6 @@
 
 <file path=word/document.xml><?xml version="1.0" encoding="utf-8"?>
-<w:document xmlns:wpc="http://schemas.microsoft.com/office/word/2010/wordprocessingCanvas" xmlns:cx="http://schemas.microsoft.com/office/drawing/2014/chartex" xmlns:cx1="http://schemas.microsoft.com/office/drawing/2015/9/8/chartex" xmlns:cx2="http://schemas.microsoft.com/office/drawing/2015/10/21/chartex" xmlns:cx3="http://schemas.microsoft.com/office/drawing/2016/5/9/chartex" xmlns:cx4="http://schemas.microsoft.com/office/drawing/2016/5/10/chartex" xmlns:cx5="http://schemas.microsoft.com/office/drawing/2016/5/11/chartex" xmlns:cx6="http://schemas.microsoft.com/office/drawing/2016/5/12/chartex" xmlns:cx7="http://schemas.microsoft.com/office/drawing/2016/5/13/chartex" xmlns:cx8="http://schemas.microsoft.com/office/drawing/2016/5/14/chartex" xmlns:mc="http://schemas.openxmlformats.org/markup-compatibility/2006" xmlns:m="http://schemas.openxmlformats.org/officeDocument/2006/math" xmlns:aink="http://schemas.microsoft.com/office/drawing/2016/ink" xmlns:am3d="http://schemas.microsoft.com/office/drawing/2017/model3d" xmlns:oel="http://schemas.microsoft.com/office/2019/extlst" xmlns:r="http://schemas.openxmlformats.org/officeDocument/2006/relationships" xmlns:wp14="http://schemas.microsoft.com/office/word/2010/wordprocessingDrawing" xmlns:wp="http://schemas.openxmlformats.org/drawingml/2006/wordprocessingDrawing" xmlns:wpg="http://schemas.microsoft.com/office/word/2010/wordprocessingGroup" xmlns:wpi="http://schemas.microsoft.com/office/word/2010/wordprocessingInk" xmlns:wps="http://schemas.microsoft.com/office/word/2010/wordprocessingShape" xmlns:o="urn:schemas-microsoft-com:office:office" xmlns:v="urn:schemas-microsoft-com:vml" xmlns:w10="urn:schemas-microsoft-com:office:word" xmlns:w="http://schemas.openxmlformats.org/wordprocessingml/2006/main" xmlns:w14="http://schemas.microsoft.com/office/word/2010/wordml" xmlns:w15="http://schemas.microsoft.com/office/word/2012/wordml" xmlns:w16cei="http://schemas.microsoft.com/office/word/2026/wordml/cei" xmlns:w16cex="http://schemas.microsoft.com/office/word/2018/wordml/cex" xmlns:w16cid="http://schemas.microsoft.com/office/word/2016/wordml/cid" xmlns:w16="http://schemas.microsoft.com/office/word/2018/wordml" xmlns:w16sdtdh="http://schemas.microsoft.com/office/word/2020/wordml/sdtdatahash" xmlns:w16sdtfl="http://schemas.microsoft.com/office/word/2024/wordml/sdtformatlock" xmlns:w16se="http://schemas.microsoft.com/office/word/2015/wordml/symex" xmlns:w16du="http://schemas.microsoft.com/office/word/2023/wordml/word16du" xmlns:wne="http://schemas.microsoft.com/office/word/2006/wordml" mc:Ignorable="w14 w15 w16se w16cid w16 w16cex w16sdtdh w16sdtfl w16du wp14">
+<w:document xmlns:wpc="http://schemas.microsoft.com/office/word/2010/wordprocessingCanvas" xmlns:cx="http://schemas.microsoft.com/office/drawing/2014/chartex" xmlns:cx1="http://schemas.microsoft.com/office/drawing/2015/9/8/chartex" xmlns:cx2="http://schemas.microsoft.com/office/drawing/2015/10/21/chartex" xmlns:cx3="http://schemas.microsoft.com/office/drawing/2016/5/9/chartex" xmlns:cx4="http://schemas.microsoft.com/office/drawing/2016/5/10/chartex" xmlns:cx5="http://schemas.microsoft.com/office/drawing/2016/5/11/chartex" xmlns:cx6="http://schemas.microsoft.com/office/drawing/2016/5/12/chartex" xmlns:cx7="http://schemas.microsoft.com/office/drawing/2016/5/13/chartex" xmlns:cx8="http://schemas.microsoft.com/office/drawing/2016/5/14/chartex" xmlns:mc="http://schemas.openxmlformats.org/markup-compatibility/2006" xmlns:aink="http://schemas.microsoft.com/office/drawing/2016/ink" xmlns:am3d="http://schemas.microsoft.com/office/drawing/2017/model3d" xmlns:o="urn:schemas-microsoft-com:office:office" xmlns:oel="http://schemas.microsoft.com/office/2019/extlst" xmlns:r="http://schemas.openxmlformats.org/officeDocument/2006/relationships" xmlns:m="http://schemas.openxmlformats.org/officeDocument/2006/math" xmlns:v="urn:schemas-microsoft-com:vml" xmlns:wp14="http://schemas.microsoft.com/office/word/2010/wordprocessingDrawing" xmlns:wp="http://schemas.openxmlformats.org/drawingml/2006/wordprocessingDrawing" xmlns:w10="urn:schemas-microsoft-com:office:word" xmlns:w="http://schemas.openxmlformats.org/wordprocessingml/2006/main" xmlns:w14="http://schemas.microsoft.com/office/word/2010/wordml" xmlns:w15="http://schemas.microsoft.com/office/word/2012/wordml" xmlns:w16cex="http://schemas.microsoft.com/office/word/2018/wordml/cex" xmlns:w16cid="http://schemas.microsoft.com/office/word/2016/wordml/cid" xmlns:w16="http://schemas.microsoft.com/office/word/2018/wordml" xmlns:w16du="http://schemas.microsoft.com/office/word/2023/wordml/word16du" xmlns:w16sdtdh="http://schemas.microsoft.com/office/word/2020/wordml/sdtdatahash" xmlns:w16sdtfl="http://schemas.microsoft.com/office/word/2024/wordml/sdtformatlock" xmlns:w16se="http://schemas.microsoft.com/office/word/2015/wordml/symex" xmlns:wpg="http://schemas.microsoft.com/office/word/2010/wordprocessingGroup" xmlns:wpi="http://schemas.microsoft.com/office/word/2010/wordprocessingInk" xmlns:wne="http://schemas.microsoft.com/office/word/2006/wordml" xmlns:wps="http://schemas.microsoft.com/office/word/2010/wordprocessingShape" mc:Ignorable="w14 w15 w16se w16cid w16 w16cex w16sdtdh w16sdtfl w16du wp14">
   <w:body>
     <w:p>
       <w:pPr>
@@ -155,7 +155,15 @@
         <w:ind w:left="792"/>
       </w:pPr>
       <w:r>
-        <w:t>Primary Field(s): Labor Economics</w:t>
+        <w:t>Primary Field</w:t>
+      </w:r>
+      <w:del w:id="0" w:author="Khandelwal, Amit" w:date="2026-08-13T12:37:00Z" w16du:dateUtc="2026-08-13T16:37:00Z">
+        <w:r>
+          <w:delText>(s)</w:delText>
+        </w:r>
+      </w:del>
+      <w:r>
+        <w:t>: Labor Economics</w:t>
       </w:r>
     </w:p>
     <w:p>
@@ -163,7 +171,15 @@
         <w:ind w:left="792"/>
       </w:pPr>
       <w:r>
-        <w:t>Secondary Field(s): Development Economics</w:t>
+        <w:t>Secondary Field</w:t>
+      </w:r>
+      <w:del w:id="1" w:author="Khandelwal, Amit" w:date="2026-08-13T12:37:00Z" w16du:dateUtc="2026-08-13T16:37:00Z">
+        <w:r>
+          <w:delText>(s)</w:delText>
+        </w:r>
+      </w:del>
+      <w:r>
+        <w:t>: Development Economics</w:t>
       </w:r>
     </w:p>
     <w:p>
@@ -1100,7 +1116,7 @@
         <w:spacing w:after="120"/>
       </w:pPr>
       <w:r>
-        <w:t>This paper fills this gap by estimating the causal effect of local workforce age composition on firms’ adoption of newly released software technologies, instrumenting the local old-worker share with a Bartik-style measure constructed from historical commuting-zone age composition and national survival rates while allowing for a rich set of controls. We use Lightcast job postings to track local employer demand for 15 newly released software technologies between 2012 and 2016, each matched to an older technology used for similar tasks. Technology adoption is measured by employer demand for frontier software skills, and workforce age composition is measured by the local share of college-educated workers ages 50 to 69.</w:t>
+        <w:t>This paper fills this gap by estimating the causal effect of local workforce age composition on firms’ adoption of newly released software technologies in the United States, instrumenting the local old-worker share with a Bartik-style measure constructed from historical commuting-zone age composition and national survival rates while allowing for a rich set of controls. We use Lightcast job postings to track local employer demand for 15 newly released software technologies between 2012 and 2016, each matched to an older technology used for similar tasks. Technology adoption is measured by employer demand for frontier software skills, and workforce age composition is measured by the local share of college-educated workers ages 50 to 69.</w:t>
       </w:r>
     </w:p>
     <w:p>
@@ -1108,7 +1124,35 @@
         <w:spacing w:after="120"/>
       </w:pPr>
       <w:r>
-        <w:t>The empirical results show that, within five years of release, employers in older labor markets post increasingly fewer vacancies requiring the newest software technologies. Moreover, the estimates indicate that the age-related adoption gap is larger when the new software is more difficult to master.</w:t>
+        <w:t xml:space="preserve">The empirical results show that, within five years of release, employers in older labor markets post </w:t>
+      </w:r>
+      <w:commentRangeStart w:id="8"/>
+      <w:r>
+        <w:t xml:space="preserve">increasingly fewer vacancies requiring </w:t>
+      </w:r>
+      <w:commentRangeEnd w:id="8"/>
+      <w:r>
+        <w:rPr>
+          <w:rStyle w:val="CommentReference"/>
+        </w:rPr>
+        <w:commentReference w:id="8"/>
+      </w:r>
+      <w:r>
+        <w:t xml:space="preserve">the newest software technologies. Moreover, the estimates indicate that the age-related adoption gap is larger when the </w:t>
+      </w:r>
+      <w:commentRangeStart w:id="9"/>
+      <w:r>
+        <w:t>new software is more difficult to master</w:t>
+      </w:r>
+      <w:commentRangeEnd w:id="9"/>
+      <w:r>
+        <w:rPr>
+          <w:rStyle w:val="CommentReference"/>
+        </w:rPr>
+        <w:commentReference w:id="9"/>
+      </w:r>
+      <w:r>
+        <w:t>.</w:t>
       </w:r>
     </w:p>
     <w:p>
@@ -1116,7 +1160,21 @@
         <w:spacing w:after="120"/>
       </w:pPr>
       <w:r>
-        <w:t>To explain our empirical findings and evaluate policy counterfactuals, we develop and calibrate a simple model linking workers’ retraining decisions to firms’ demand for frontier-technology skills. The key mechanism is finite-horizon retraining: because older workers have shorter remaining careers, they have less time to recover learning costs, making the same skill investment less attractive late in the career. The calibrated model shows that policy margins changing workforce age structure can have different implications for technology adoption. Aging caused by weak inflows of young workers, as under low fertility or low migration, slows adoption by reducing the share of workers with long retraining horizons. By contrast, longer expected working lives, as under delayed retirement, can mitigate this force by increasing older workers’ return to skill investment.</w:t>
+        <w:t xml:space="preserve">To explain our empirical findings and evaluate policy counterfactuals, we develop and calibrate a simple model linking workers’ retraining decisions to firms’ demand for frontier-technology skills. The key mechanism is finite-horizon retraining: because older workers have shorter remaining careers, they have less time to recover learning costs, making the same skill investment less attractive late in the career. </w:t>
+      </w:r>
+      <w:commentRangeStart w:id="10"/>
+      <w:r>
+        <w:t>The calibrated model shows that policy margins changing workforce age structure can have different implications for technology adoption</w:t>
+      </w:r>
+      <w:commentRangeEnd w:id="10"/>
+      <w:r>
+        <w:rPr>
+          <w:rStyle w:val="CommentReference"/>
+        </w:rPr>
+        <w:commentReference w:id="10"/>
+      </w:r>
+      <w:r>
+        <w:t>. Aging caused by weak inflows of young workers, as under low fertility or low migration, slows adoption by reducing the share of workers with long retraining horizons. By contrast, longer expected working lives, as under delayed retirement, can mitigate this force by increasing older workers’ return to skill investment.</w:t>
       </w:r>
     </w:p>
     <w:p>
@@ -1192,7 +1250,7 @@
         <w:spacing w:after="120"/>
       </w:pPr>
       <w:r>
-        <w:t>Migration is a central economic strategy for many Salvadoran households, including families whose children may later consider migrating to the United States. The possibility of migration can shape educational investment long before migration occurs by changing how families perceive the returns to schooling. In a household survey conducted with IPA in El Salvador, we find that caretakers of children ages 8 to 12 substantially overestimate wages in the United States, especially for workers with secondary schooling, by more than 300 percent. Respondents also overestimate the return to education in the United States relative to El Salvador, and these perceived U.S. returns are strongly associated with the amount of time parents spend helping children with schoolwork. These patterns suggest that beliefs about foreign labor-market opportunities may already shape human-capital investment at home.</w:t>
+        <w:t>Migration is a central economic strategy for many Central American households, including Salvadoran families whose children may later consider migrating to the United States. The possibility of migration can shape educational investment long before migration occurs by changing how families perceive the returns to schooling. In a household survey conducted in El Salvador, we find that caretakers of children ages 8 to 12 substantially overestimate wages in the United States, especially for workers with secondary schooling, by more than 300 percent. Respondents also overestimate the return to education in the United States relative to El Salvador, and these perceived U.S. returns are strongly associated with the amount of time parents spend helping children with schoolwork. These patterns suggest that beliefs about foreign labor-market opportunities may shape human-capital investment at home.</w:t>
       </w:r>
     </w:p>
     <w:p>
@@ -1200,12 +1258,15 @@
         <w:spacing w:after="120"/>
       </w:pPr>
       <w:r>
+        <w:t xml:space="preserve">Building on this evidence, the project studies how perceived returns to education abroad, perceived migration costs and barriers, and domestic education returns jointly affect children’s schooling investments and household migration decisions. The empirical design uses a </w:t>
+      </w:r>
+      <w:r>
         <w:lastRenderedPageBreak/>
-        <w:t>Building on this evidence, the project studies how perceived returns to education abroad, perceived migration costs and barriers, and domestic education returns jointly affect children’s schooling investments and household migration decisions. The empirical design uses a randomized information experiment with caretakers of school-age children in El Salvador. Participants receive experimentally varied information about U.S. wages for Salvadorans, migration success probabilities, wage uncertainty, and returns to education in El Salvador. The experiment measures how these information treatments change beliefs, migration intentions, and willingness to invest in supplemental education. The project tests a central mechanism in the brain-gain hypothesis: whether the possibility of migration raises education investment before migration occurs, and whether families respond more strongly to information about foreign earnings, migration risk, or domestic returns to schooling.</w:t>
+        <w:t>randomized information experiment with caretakers of school-age children in El Salvador. Participants receive experimentally varied information about U.S. wages for Salvadorans, migration success probabilities, wage uncertainty, and returns to education in El Salvador. The experiment measures how these information treatments change beliefs, migration intentions, and willingness to invest in supplemental education. The project tests a central mechanism in the brain-gain hypothesis: whether the possibility of migration raises education investment before migration occurs, and whether families respond more strongly to information about foreign earnings, migration risk, or domestic returns to schooling.</w:t>
       </w:r>
     </w:p>
     <w:sectPr>
-      <w:headerReference w:type="default" r:id="rId14"/>
+      <w:headerReference w:type="default" r:id="rId18"/>
       <w:type w:val="continuous"/>
       <w:pgSz w:w="12240" w:h="15840"/>
       <w:pgMar w:top="893" w:right="1368" w:bottom="1008" w:left="1368" w:header="691" w:footer="720" w:gutter="0"/>
@@ -1216,8 +1277,217 @@
 </w:document>
 </file>
 
+<file path=word/comments.xml><?xml version="1.0" encoding="utf-8"?>
+<w:comments xmlns:wpc="http://schemas.microsoft.com/office/word/2010/wordprocessingCanvas" xmlns:cx="http://schemas.microsoft.com/office/drawing/2014/chartex" xmlns:cx1="http://schemas.microsoft.com/office/drawing/2015/9/8/chartex" xmlns:cx2="http://schemas.microsoft.com/office/drawing/2015/10/21/chartex" xmlns:cx3="http://schemas.microsoft.com/office/drawing/2016/5/9/chartex" xmlns:cx4="http://schemas.microsoft.com/office/drawing/2016/5/10/chartex" xmlns:cx5="http://schemas.microsoft.com/office/drawing/2016/5/11/chartex" xmlns:cx6="http://schemas.microsoft.com/office/drawing/2016/5/12/chartex" xmlns:cx7="http://schemas.microsoft.com/office/drawing/2016/5/13/chartex" xmlns:cx8="http://schemas.microsoft.com/office/drawing/2016/5/14/chartex" xmlns:mc="http://schemas.openxmlformats.org/markup-compatibility/2006" xmlns:aink="http://schemas.microsoft.com/office/drawing/2016/ink" xmlns:am3d="http://schemas.microsoft.com/office/drawing/2017/model3d" xmlns:o="urn:schemas-microsoft-com:office:office" xmlns:oel="http://schemas.microsoft.com/office/2019/extlst" xmlns:r="http://schemas.openxmlformats.org/officeDocument/2006/relationships" xmlns:m="http://schemas.openxmlformats.org/officeDocument/2006/math" xmlns:v="urn:schemas-microsoft-com:vml" xmlns:wp14="http://schemas.microsoft.com/office/word/2010/wordprocessingDrawing" xmlns:wp="http://schemas.openxmlformats.org/drawingml/2006/wordprocessingDrawing" xmlns:w10="urn:schemas-microsoft-com:office:word" xmlns:w="http://schemas.openxmlformats.org/wordprocessingml/2006/main" xmlns:w14="http://schemas.microsoft.com/office/word/2010/wordml" xmlns:w15="http://schemas.microsoft.com/office/word/2012/wordml" xmlns:w16cex="http://schemas.microsoft.com/office/word/2018/wordml/cex" xmlns:w16cid="http://schemas.microsoft.com/office/word/2016/wordml/cid" xmlns:w16="http://schemas.microsoft.com/office/word/2018/wordml" xmlns:w16du="http://schemas.microsoft.com/office/word/2023/wordml/word16du" xmlns:w16sdtdh="http://schemas.microsoft.com/office/word/2020/wordml/sdtdatahash" xmlns:w16sdtfl="http://schemas.microsoft.com/office/word/2024/wordml/sdtformatlock" xmlns:w16se="http://schemas.microsoft.com/office/word/2015/wordml/symex" xmlns:wpg="http://schemas.microsoft.com/office/word/2010/wordprocessingGroup" xmlns:wpi="http://schemas.microsoft.com/office/word/2010/wordprocessingInk" xmlns:wne="http://schemas.microsoft.com/office/word/2006/wordml" xmlns:wps="http://schemas.microsoft.com/office/word/2010/wordprocessingShape" mc:Ignorable="w14 w15 w16se w16cid w16 w16cex w16sdtdh w16sdtfl w16du wp14">
+  <w:comment w:id="4" w:author="Khandelwal, Amit" w:date="2026-08-13T12:40:00Z" w:initials="KA">
+    <w:p>
+      <w:r>
+        <w:rPr>
+          <w:rStyle w:val="CommentReference"/>
+        </w:rPr>
+        <w:annotationRef/>
+      </w:r>
+      <w:r>
+        <w:rPr>
+          <w:color w:val="000000"/>
+          <w:sz w:val="20"/>
+          <w:szCs w:val="20"/>
+        </w:rPr>
+        <w:t>People often cite Japan as a counter to this? Old age causes firms to invest new technologies. I think here you are referring to older workers themselves using new technologies at the work place, which becomes clearer going down, but just flagging that the opposite reaction came to mind as I read this.</w:t>
+      </w:r>
+    </w:p>
+  </w:comment>
+  <w:comment w:id="5" w:author="Khandelwal, Amit" w:date="2026-08-13T12:40:00Z" w:initials="KA">
+    <w:p>
+      <w:r>
+        <w:rPr>
+          <w:rStyle w:val="CommentReference"/>
+        </w:rPr>
+        <w:annotationRef/>
+      </w:r>
+      <w:r>
+        <w:rPr>
+          <w:color w:val="000000"/>
+          <w:sz w:val="20"/>
+          <w:szCs w:val="20"/>
+        </w:rPr>
+        <w:t>Which country?</w:t>
+      </w:r>
+    </w:p>
+  </w:comment>
+  <w:comment w:id="6" w:author="Khandelwal, Amit" w:date="2026-08-13T12:40:00Z" w:initials="KA">
+    <w:p>
+      <w:r>
+        <w:rPr>
+          <w:rStyle w:val="CommentReference"/>
+        </w:rPr>
+        <w:annotationRef/>
+      </w:r>
+      <w:r>
+        <w:rPr>
+          <w:color w:val="000000"/>
+          <w:sz w:val="20"/>
+          <w:szCs w:val="20"/>
+        </w:rPr>
+        <w:t>“Adoption”?</w:t>
+      </w:r>
+    </w:p>
+  </w:comment>
+  <w:comment w:id="7" w:author="Khandelwal, Amit" w:date="2026-08-13T12:41:00Z" w:initials="KA">
+    <w:p>
+      <w:r>
+        <w:rPr>
+          <w:rStyle w:val="CommentReference"/>
+        </w:rPr>
+        <w:annotationRef/>
+      </w:r>
+      <w:r>
+        <w:rPr>
+          <w:color w:val="000000"/>
+          <w:sz w:val="20"/>
+          <w:szCs w:val="20"/>
+        </w:rPr>
+        <w:t>This sounds important, may need its own sentence. You did th matching?</w:t>
+      </w:r>
+    </w:p>
+  </w:comment>
+  <w:comment w:id="8" w:author="Khandelwal, Amit" w:date="2026-08-13T12:41:00Z" w:initials="KA">
+    <w:p>
+      <w:r>
+        <w:rPr>
+          <w:rStyle w:val="CommentReference"/>
+        </w:rPr>
+        <w:annotationRef/>
+      </w:r>
+      <w:r>
+        <w:rPr>
+          <w:color w:val="000000"/>
+          <w:sz w:val="20"/>
+          <w:szCs w:val="20"/>
+        </w:rPr>
+        <w:t>Put some numbers</w:t>
+      </w:r>
+    </w:p>
+  </w:comment>
+  <w:comment w:id="9" w:author="Khandelwal, Amit" w:date="2026-08-13T12:42:00Z" w:initials="KA">
+    <w:p>
+      <w:r>
+        <w:rPr>
+          <w:rStyle w:val="CommentReference"/>
+        </w:rPr>
+        <w:annotationRef/>
+      </w:r>
+      <w:r>
+        <w:rPr>
+          <w:color w:val="000000"/>
+          <w:sz w:val="20"/>
+          <w:szCs w:val="20"/>
+        </w:rPr>
+        <w:t>Maybe indicate how you measure this</w:t>
+      </w:r>
+    </w:p>
+  </w:comment>
+  <w:comment w:id="10" w:author="Khandelwal, Amit" w:date="2026-08-13T12:43:00Z" w:initials="KA">
+    <w:p>
+      <w:r>
+        <w:rPr>
+          <w:rStyle w:val="CommentReference"/>
+        </w:rPr>
+        <w:annotationRef/>
+      </w:r>
+      <w:r>
+        <w:rPr>
+          <w:color w:val="000000"/>
+          <w:sz w:val="20"/>
+          <w:szCs w:val="20"/>
+        </w:rPr>
+        <w:t>I think you should offer one or two key numbers that come from the calibration. Do you run any counterfactual exercises?</w:t>
+      </w:r>
+    </w:p>
+  </w:comment>
+  <w:comment w:id="11" w:author="Khandelwal, Amit" w:date="2026-08-13T12:44:00Z" w:initials="KA">
+    <w:p>
+      <w:r>
+        <w:rPr>
+          <w:rStyle w:val="CommentReference"/>
+        </w:rPr>
+        <w:annotationRef/>
+      </w:r>
+      <w:r>
+        <w:rPr>
+          <w:color w:val="000000"/>
+          <w:sz w:val="20"/>
+          <w:szCs w:val="20"/>
+        </w:rPr>
+        <w:t>Central American. You can broaden this first sentence</w:t>
+      </w:r>
+    </w:p>
+  </w:comment>
+  <w:comment w:id="13" w:author="Khandelwal, Amit" w:date="2026-08-13T12:44:00Z" w:initials="KA">
+    <w:p>
+      <w:r>
+        <w:rPr>
+          <w:rStyle w:val="CommentReference"/>
+        </w:rPr>
+        <w:annotationRef/>
+      </w:r>
+      <w:r>
+        <w:rPr>
+          <w:color w:val="000000"/>
+          <w:sz w:val="20"/>
+          <w:szCs w:val="20"/>
+        </w:rPr>
+        <w:t>Either write out or remove</w:t>
+      </w:r>
+    </w:p>
+  </w:comment>
+</w:comments>
+</file>
+
+<file path=word/commentsExtended.xml><?xml version="1.0" encoding="utf-8"?>
+<w15:commentsEx xmlns:wpc="http://schemas.microsoft.com/office/word/2010/wordprocessingCanvas" xmlns:cx="http://schemas.microsoft.com/office/drawing/2014/chartex" xmlns:cx1="http://schemas.microsoft.com/office/drawing/2015/9/8/chartex" xmlns:cx2="http://schemas.microsoft.com/office/drawing/2015/10/21/chartex" xmlns:cx3="http://schemas.microsoft.com/office/drawing/2016/5/9/chartex" xmlns:cx4="http://schemas.microsoft.com/office/drawing/2016/5/10/chartex" xmlns:cx5="http://schemas.microsoft.com/office/drawing/2016/5/11/chartex" xmlns:cx6="http://schemas.microsoft.com/office/drawing/2016/5/12/chartex" xmlns:cx7="http://schemas.microsoft.com/office/drawing/2016/5/13/chartex" xmlns:cx8="http://schemas.microsoft.com/office/drawing/2016/5/14/chartex" xmlns:mc="http://schemas.openxmlformats.org/markup-compatibility/2006" xmlns:aink="http://schemas.microsoft.com/office/drawing/2016/ink" xmlns:am3d="http://schemas.microsoft.com/office/drawing/2017/model3d" xmlns:o="urn:schemas-microsoft-com:office:office" xmlns:oel="http://schemas.microsoft.com/office/2019/extlst" xmlns:r="http://schemas.openxmlformats.org/officeDocument/2006/relationships" xmlns:m="http://schemas.openxmlformats.org/officeDocument/2006/math" xmlns:v="urn:schemas-microsoft-com:vml" xmlns:wp14="http://schemas.microsoft.com/office/word/2010/wordprocessingDrawing" xmlns:wp="http://schemas.openxmlformats.org/drawingml/2006/wordprocessingDrawing" xmlns:w10="urn:schemas-microsoft-com:office:word" xmlns:w="http://schemas.openxmlformats.org/wordprocessingml/2006/main" xmlns:w14="http://schemas.microsoft.com/office/word/2010/wordml" xmlns:w15="http://schemas.microsoft.com/office/word/2012/wordml" xmlns:w16cex="http://schemas.microsoft.com/office/word/2018/wordml/cex" xmlns:w16cid="http://schemas.microsoft.com/office/word/2016/wordml/cid" xmlns:w16="http://schemas.microsoft.com/office/word/2018/wordml" xmlns:w16du="http://schemas.microsoft.com/office/word/2023/wordml/word16du" xmlns:w16sdtdh="http://schemas.microsoft.com/office/word/2020/wordml/sdtdatahash" xmlns:w16sdtfl="http://schemas.microsoft.com/office/word/2024/wordml/sdtformatlock" xmlns:w16se="http://schemas.microsoft.com/office/word/2015/wordml/symex" xmlns:wpg="http://schemas.microsoft.com/office/word/2010/wordprocessingGroup" xmlns:wpi="http://schemas.microsoft.com/office/word/2010/wordprocessingInk" xmlns:wne="http://schemas.microsoft.com/office/word/2006/wordml" xmlns:wps="http://schemas.microsoft.com/office/word/2010/wordprocessingShape" mc:Ignorable="w14 w15 w16se w16cid w16 w16cex w16sdtdh w16sdtfl w16du wp14">
+  <w15:commentEx w15:paraId="038F5ED2" w15:done="0"/>
+  <w15:commentEx w15:paraId="06141BE3" w15:done="0"/>
+  <w15:commentEx w15:paraId="72E2A741" w15:done="0"/>
+  <w15:commentEx w15:paraId="622D893F" w15:done="0"/>
+  <w15:commentEx w15:paraId="2A5012B8" w15:done="0"/>
+  <w15:commentEx w15:paraId="5A4F4BF7" w15:done="0"/>
+  <w15:commentEx w15:paraId="086F4992" w15:done="0"/>
+  <w15:commentEx w15:paraId="13398F3D" w15:done="0"/>
+  <w15:commentEx w15:paraId="4A482FC3" w15:done="0"/>
+</w15:commentsEx>
+</file>
+
+<file path=word/commentsExtensible.xml><?xml version="1.0" encoding="utf-8"?>
+<w16cex:commentsExtensible xmlns:wpc="http://schemas.microsoft.com/office/word/2010/wordprocessingCanvas" xmlns:cx="http://schemas.microsoft.com/office/drawing/2014/chartex" xmlns:cx1="http://schemas.microsoft.com/office/drawing/2015/9/8/chartex" xmlns:cx2="http://schemas.microsoft.com/office/drawing/2015/10/21/chartex" xmlns:cx3="http://schemas.microsoft.com/office/drawing/2016/5/9/chartex" xmlns:cx4="http://schemas.microsoft.com/office/drawing/2016/5/10/chartex" xmlns:cx5="http://schemas.microsoft.com/office/drawing/2016/5/11/chartex" xmlns:cx6="http://schemas.microsoft.com/office/drawing/2016/5/12/chartex" xmlns:cx7="http://schemas.microsoft.com/office/drawing/2016/5/13/chartex" xmlns:cx8="http://schemas.microsoft.com/office/drawing/2016/5/14/chartex" xmlns:cr="http://schemas.microsoft.com/office/comments/2020/reactions" xmlns:mc="http://schemas.openxmlformats.org/markup-compatibility/2006" xmlns:aink="http://schemas.microsoft.com/office/drawing/2016/ink" xmlns:am3d="http://schemas.microsoft.com/office/drawing/2017/model3d" xmlns:o="urn:schemas-microsoft-com:office:office" xmlns:oel="http://schemas.microsoft.com/office/2019/extlst" xmlns:r="http://schemas.openxmlformats.org/officeDocument/2006/relationships" xmlns:m="http://schemas.openxmlformats.org/officeDocument/2006/math" xmlns:v="urn:schemas-microsoft-com:vml" xmlns:wp14="http://schemas.microsoft.com/office/word/2010/wordprocessingDrawing" xmlns:wp="http://schemas.openxmlformats.org/drawingml/2006/wordprocessingDrawing" xmlns:w10="urn:schemas-microsoft-com:office:word" xmlns:w="http://schemas.openxmlformats.org/wordprocessingml/2006/main" xmlns:w14="http://schemas.microsoft.com/office/word/2010/wordml" xmlns:w15="http://schemas.microsoft.com/office/word/2012/wordml" xmlns:w16cex="http://schemas.microsoft.com/office/word/2018/wordml/cex" xmlns:w16cid="http://schemas.microsoft.com/office/word/2016/wordml/cid" xmlns:w16="http://schemas.microsoft.com/office/word/2018/wordml" xmlns:w16du="http://schemas.microsoft.com/office/word/2023/wordml/word16du" xmlns:w16sdtdh="http://schemas.microsoft.com/office/word/2020/wordml/sdtdatahash" xmlns:w16sdtfl="http://schemas.microsoft.com/office/word/2024/wordml/sdtformatlock" xmlns:w16se="http://schemas.microsoft.com/office/word/2015/wordml/symex" xmlns:wpg="http://schemas.microsoft.com/office/word/2010/wordprocessingGroup" xmlns:wpi="http://schemas.microsoft.com/office/word/2010/wordprocessingInk" xmlns:wne="http://schemas.microsoft.com/office/word/2006/wordml" xmlns:wps="http://schemas.microsoft.com/office/word/2010/wordprocessingShape" mc:Ignorable="w14 w15 w16se w16cid w16 w16cex w16sdtdh w16sdtfl cr w16du wp14">
+  <w16cex:commentExtensible w16cex:durableId="7569DCFE" w16cex:dateUtc="2026-08-13T16:40:00Z"/>
+  <w16cex:commentExtensible w16cex:durableId="37FC7AA9" w16cex:dateUtc="2026-08-13T16:40:00Z"/>
+  <w16cex:commentExtensible w16cex:durableId="4E7C8488" w16cex:dateUtc="2026-08-13T16:40:00Z"/>
+  <w16cex:commentExtensible w16cex:durableId="36F12051" w16cex:dateUtc="2026-08-13T16:41:00Z"/>
+  <w16cex:commentExtensible w16cex:durableId="680D5190" w16cex:dateUtc="2026-08-13T16:41:00Z"/>
+  <w16cex:commentExtensible w16cex:durableId="6B12A4AC" w16cex:dateUtc="2026-08-13T16:42:00Z"/>
+  <w16cex:commentExtensible w16cex:durableId="7F1CB589" w16cex:dateUtc="2026-08-13T16:43:00Z"/>
+  <w16cex:commentExtensible w16cex:durableId="0F40AB4E" w16cex:dateUtc="2026-08-13T16:44:00Z"/>
+  <w16cex:commentExtensible w16cex:durableId="5CD9679F" w16cex:dateUtc="2026-08-13T16:44:00Z"/>
+</w16cex:commentsExtensible>
+</file>
+
+<file path=word/commentsIds.xml><?xml version="1.0" encoding="utf-8"?>
+<w16cid:commentsIds xmlns:wpc="http://schemas.microsoft.com/office/word/2010/wordprocessingCanvas" xmlns:cx="http://schemas.microsoft.com/office/drawing/2014/chartex" xmlns:cx1="http://schemas.microsoft.com/office/drawing/2015/9/8/chartex" xmlns:cx2="http://schemas.microsoft.com/office/drawing/2015/10/21/chartex" xmlns:cx3="http://schemas.microsoft.com/office/drawing/2016/5/9/chartex" xmlns:cx4="http://schemas.microsoft.com/office/drawing/2016/5/10/chartex" xmlns:cx5="http://schemas.microsoft.com/office/drawing/2016/5/11/chartex" xmlns:cx6="http://schemas.microsoft.com/office/drawing/2016/5/12/chartex" xmlns:cx7="http://schemas.microsoft.com/office/drawing/2016/5/13/chartex" xmlns:cx8="http://schemas.microsoft.com/office/drawing/2016/5/14/chartex" xmlns:mc="http://schemas.openxmlformats.org/markup-compatibility/2006" xmlns:aink="http://schemas.microsoft.com/office/drawing/2016/ink" xmlns:am3d="http://schemas.microsoft.com/office/drawing/2017/model3d" xmlns:o="urn:schemas-microsoft-com:office:office" xmlns:oel="http://schemas.microsoft.com/office/2019/extlst" xmlns:r="http://schemas.openxmlformats.org/officeDocument/2006/relationships" xmlns:m="http://schemas.openxmlformats.org/officeDocument/2006/math" xmlns:v="urn:schemas-microsoft-com:vml" xmlns:wp14="http://schemas.microsoft.com/office/word/2010/wordprocessingDrawing" xmlns:wp="http://schemas.openxmlformats.org/drawingml/2006/wordprocessingDrawing" xmlns:w10="urn:schemas-microsoft-com:office:word" xmlns:w="http://schemas.openxmlformats.org/wordprocessingml/2006/main" xmlns:w14="http://schemas.microsoft.com/office/word/2010/wordml" xmlns:w15="http://schemas.microsoft.com/office/word/2012/wordml" xmlns:w16cex="http://schemas.microsoft.com/office/word/2018/wordml/cex" xmlns:w16cid="http://schemas.microsoft.com/office/word/2016/wordml/cid" xmlns:w16="http://schemas.microsoft.com/office/word/2018/wordml" xmlns:w16du="http://schemas.microsoft.com/office/word/2023/wordml/word16du" xmlns:w16sdtdh="http://schemas.microsoft.com/office/word/2020/wordml/sdtdatahash" xmlns:w16sdtfl="http://schemas.microsoft.com/office/word/2024/wordml/sdtformatlock" xmlns:w16se="http://schemas.microsoft.com/office/word/2015/wordml/symex" xmlns:wpg="http://schemas.microsoft.com/office/word/2010/wordprocessingGroup" xmlns:wpi="http://schemas.microsoft.com/office/word/2010/wordprocessingInk" xmlns:wne="http://schemas.microsoft.com/office/word/2006/wordml" xmlns:wps="http://schemas.microsoft.com/office/word/2010/wordprocessingShape" mc:Ignorable="w14 w15 w16se w16cid w16 w16cex w16sdtdh w16sdtfl w16du wp14">
+  <w16cid:commentId w16cid:paraId="038F5ED2" w16cid:durableId="7569DCFE"/>
+  <w16cid:commentId w16cid:paraId="06141BE3" w16cid:durableId="37FC7AA9"/>
+  <w16cid:commentId w16cid:paraId="72E2A741" w16cid:durableId="4E7C8488"/>
+  <w16cid:commentId w16cid:paraId="622D893F" w16cid:durableId="36F12051"/>
+  <w16cid:commentId w16cid:paraId="2A5012B8" w16cid:durableId="680D5190"/>
+  <w16cid:commentId w16cid:paraId="5A4F4BF7" w16cid:durableId="6B12A4AC"/>
+  <w16cid:commentId w16cid:paraId="086F4992" w16cid:durableId="7F1CB589"/>
+  <w16cid:commentId w16cid:paraId="13398F3D" w16cid:durableId="0F40AB4E"/>
+  <w16cid:commentId w16cid:paraId="4A482FC3" w16cid:durableId="5CD9679F"/>
+</w16cid:commentsIds>
+</file>
+
 <file path=word/endnotes.xml><?xml version="1.0" encoding="utf-8"?>
-<w:endnotes xmlns:wpc="http://schemas.microsoft.com/office/word/2010/wordprocessingCanvas" xmlns:cx="http://schemas.microsoft.com/office/drawing/2014/chartex" xmlns:cx1="http://schemas.microsoft.com/office/drawing/2015/9/8/chartex" xmlns:cx2="http://schemas.microsoft.com/office/drawing/2015/10/21/chartex" xmlns:cx3="http://schemas.microsoft.com/office/drawing/2016/5/9/chartex" xmlns:cx4="http://schemas.microsoft.com/office/drawing/2016/5/10/chartex" xmlns:cx5="http://schemas.microsoft.com/office/drawing/2016/5/11/chartex" xmlns:cx6="http://schemas.microsoft.com/office/drawing/2016/5/12/chartex" xmlns:cx7="http://schemas.microsoft.com/office/drawing/2016/5/13/chartex" xmlns:cx8="http://schemas.microsoft.com/office/drawing/2016/5/14/chartex" xmlns:mc="http://schemas.openxmlformats.org/markup-compatibility/2006" xmlns:m="http://schemas.openxmlformats.org/officeDocument/2006/math" xmlns:aink="http://schemas.microsoft.com/office/drawing/2016/ink" xmlns:am3d="http://schemas.microsoft.com/office/drawing/2017/model3d" xmlns:oel="http://schemas.microsoft.com/office/2019/extlst" xmlns:r="http://schemas.openxmlformats.org/officeDocument/2006/relationships" xmlns:wp14="http://schemas.microsoft.com/office/word/2010/wordprocessingDrawing" xmlns:wp="http://schemas.openxmlformats.org/drawingml/2006/wordprocessingDrawing" xmlns:wpg="http://schemas.microsoft.com/office/word/2010/wordprocessingGroup" xmlns:wpi="http://schemas.microsoft.com/office/word/2010/wordprocessingInk" xmlns:wps="http://schemas.microsoft.com/office/word/2010/wordprocessingShape" xmlns:o="urn:schemas-microsoft-com:office:office" xmlns:v="urn:schemas-microsoft-com:vml" xmlns:w10="urn:schemas-microsoft-com:office:word" xmlns:w="http://schemas.openxmlformats.org/wordprocessingml/2006/main" xmlns:w14="http://schemas.microsoft.com/office/word/2010/wordml" xmlns:w15="http://schemas.microsoft.com/office/word/2012/wordml" xmlns:w16cei="http://schemas.microsoft.com/office/word/2026/wordml/cei" xmlns:w16cex="http://schemas.microsoft.com/office/word/2018/wordml/cex" xmlns:w16cid="http://schemas.microsoft.com/office/word/2016/wordml/cid" xmlns:w16="http://schemas.microsoft.com/office/word/2018/wordml" xmlns:w16sdtdh="http://schemas.microsoft.com/office/word/2020/wordml/sdtdatahash" xmlns:w16sdtfl="http://schemas.microsoft.com/office/word/2024/wordml/sdtformatlock" xmlns:w16se="http://schemas.microsoft.com/office/word/2015/wordml/symex" xmlns:w16du="http://schemas.microsoft.com/office/word/2023/wordml/word16du" xmlns:wne="http://schemas.microsoft.com/office/word/2006/wordml" mc:Ignorable="w14 w15 w16se w16cid w16 w16cex w16sdtdh w16sdtfl w16du wp14">
+<w:endnotes xmlns:wpc="http://schemas.microsoft.com/office/word/2010/wordprocessingCanvas" xmlns:cx="http://schemas.microsoft.com/office/drawing/2014/chartex" xmlns:cx1="http://schemas.microsoft.com/office/drawing/2015/9/8/chartex" xmlns:cx2="http://schemas.microsoft.com/office/drawing/2015/10/21/chartex" xmlns:cx3="http://schemas.microsoft.com/office/drawing/2016/5/9/chartex" xmlns:cx4="http://schemas.microsoft.com/office/drawing/2016/5/10/chartex" xmlns:cx5="http://schemas.microsoft.com/office/drawing/2016/5/11/chartex" xmlns:cx6="http://schemas.microsoft.com/office/drawing/2016/5/12/chartex" xmlns:cx7="http://schemas.microsoft.com/office/drawing/2016/5/13/chartex" xmlns:cx8="http://schemas.microsoft.com/office/drawing/2016/5/14/chartex" xmlns:mc="http://schemas.openxmlformats.org/markup-compatibility/2006" xmlns:aink="http://schemas.microsoft.com/office/drawing/2016/ink" xmlns:am3d="http://schemas.microsoft.com/office/drawing/2017/model3d" xmlns:o="urn:schemas-microsoft-com:office:office" xmlns:oel="http://schemas.microsoft.com/office/2019/extlst" xmlns:r="http://schemas.openxmlformats.org/officeDocument/2006/relationships" xmlns:m="http://schemas.openxmlformats.org/officeDocument/2006/math" xmlns:v="urn:schemas-microsoft-com:vml" xmlns:wp14="http://schemas.microsoft.com/office/word/2010/wordprocessingDrawing" xmlns:wp="http://schemas.openxmlformats.org/drawingml/2006/wordprocessingDrawing" xmlns:w10="urn:schemas-microsoft-com:office:word" xmlns:w="http://schemas.openxmlformats.org/wordprocessingml/2006/main" xmlns:w14="http://schemas.microsoft.com/office/word/2010/wordml" xmlns:w15="http://schemas.microsoft.com/office/word/2012/wordml" xmlns:w16cex="http://schemas.microsoft.com/office/word/2018/wordml/cex" xmlns:w16cid="http://schemas.microsoft.com/office/word/2016/wordml/cid" xmlns:w16="http://schemas.microsoft.com/office/word/2018/wordml" xmlns:w16du="http://schemas.microsoft.com/office/word/2023/wordml/word16du" xmlns:w16sdtdh="http://schemas.microsoft.com/office/word/2020/wordml/sdtdatahash" xmlns:w16sdtfl="http://schemas.microsoft.com/office/word/2024/wordml/sdtformatlock" xmlns:w16se="http://schemas.microsoft.com/office/word/2015/wordml/symex" xmlns:wpg="http://schemas.microsoft.com/office/word/2010/wordprocessingGroup" xmlns:wpi="http://schemas.microsoft.com/office/word/2010/wordprocessingInk" xmlns:wne="http://schemas.microsoft.com/office/word/2006/wordml" xmlns:wps="http://schemas.microsoft.com/office/word/2010/wordprocessingShape" mc:Ignorable="w14 w15 w16se w16cid w16 w16cex w16sdtdh w16sdtfl w16du wp14">
   <w:endnote w:type="separator" w:id="-1">
     <w:p>
       <w:r>
@@ -1236,7 +1506,7 @@
 </file>
 
 <file path=word/footnotes.xml><?xml version="1.0" encoding="utf-8"?>
-<w:footnotes xmlns:wpc="http://schemas.microsoft.com/office/word/2010/wordprocessingCanvas" xmlns:cx="http://schemas.microsoft.com/office/drawing/2014/chartex" xmlns:cx1="http://schemas.microsoft.com/office/drawing/2015/9/8/chartex" xmlns:cx2="http://schemas.microsoft.com/office/drawing/2015/10/21/chartex" xmlns:cx3="http://schemas.microsoft.com/office/drawing/2016/5/9/chartex" xmlns:cx4="http://schemas.microsoft.com/office/drawing/2016/5/10/chartex" xmlns:cx5="http://schemas.microsoft.com/office/drawing/2016/5/11/chartex" xmlns:cx6="http://schemas.microsoft.com/office/drawing/2016/5/12/chartex" xmlns:cx7="http://schemas.microsoft.com/office/drawing/2016/5/13/chartex" xmlns:cx8="http://schemas.microsoft.com/office/drawing/2016/5/14/chartex" xmlns:mc="http://schemas.openxmlformats.org/markup-compatibility/2006" xmlns:m="http://schemas.openxmlformats.org/officeDocument/2006/math" xmlns:aink="http://schemas.microsoft.com/office/drawing/2016/ink" xmlns:am3d="http://schemas.microsoft.com/office/drawing/2017/model3d" xmlns:oel="http://schemas.microsoft.com/office/2019/extlst" xmlns:r="http://schemas.openxmlformats.org/officeDocument/2006/relationships" xmlns:wp14="http://schemas.microsoft.com/office/word/2010/wordprocessingDrawing" xmlns:wp="http://schemas.openxmlformats.org/drawingml/2006/wordprocessingDrawing" xmlns:wpg="http://schemas.microsoft.com/office/word/2010/wordprocessingGroup" xmlns:wpi="http://schemas.microsoft.com/office/word/2010/wordprocessingInk" xmlns:wps="http://schemas.microsoft.com/office/word/2010/wordprocessingShape" xmlns:o="urn:schemas-microsoft-com:office:office" xmlns:v="urn:schemas-microsoft-com:vml" xmlns:w10="urn:schemas-microsoft-com:office:word" xmlns:w="http://schemas.openxmlformats.org/wordprocessingml/2006/main" xmlns:w14="http://schemas.microsoft.com/office/word/2010/wordml" xmlns:w15="http://schemas.microsoft.com/office/word/2012/wordml" xmlns:w16cei="http://schemas.microsoft.com/office/word/2026/wordml/cei" xmlns:w16cex="http://schemas.microsoft.com/office/word/2018/wordml/cex" xmlns:w16cid="http://schemas.microsoft.com/office/word/2016/wordml/cid" xmlns:w16="http://schemas.microsoft.com/office/word/2018/wordml" xmlns:w16sdtdh="http://schemas.microsoft.com/office/word/2020/wordml/sdtdatahash" xmlns:w16sdtfl="http://schemas.microsoft.com/office/word/2024/wordml/sdtformatlock" xmlns:w16se="http://schemas.microsoft.com/office/word/2015/wordml/symex" xmlns:w16du="http://schemas.microsoft.com/office/word/2023/wordml/word16du" xmlns:wne="http://schemas.microsoft.com/office/word/2006/wordml" mc:Ignorable="w14 w15 w16se w16cid w16 w16cex w16sdtdh w16sdtfl w16du wp14">
+<w:footnotes xmlns:wpc="http://schemas.microsoft.com/office/word/2010/wordprocessingCanvas" xmlns:cx="http://schemas.microsoft.com/office/drawing/2014/chartex" xmlns:cx1="http://schemas.microsoft.com/office/drawing/2015/9/8/chartex" xmlns:cx2="http://schemas.microsoft.com/office/drawing/2015/10/21/chartex" xmlns:cx3="http://schemas.microsoft.com/office/drawing/2016/5/9/chartex" xmlns:cx4="http://schemas.microsoft.com/office/drawing/2016/5/10/chartex" xmlns:cx5="http://schemas.microsoft.com/office/drawing/2016/5/11/chartex" xmlns:cx6="http://schemas.microsoft.com/office/drawing/2016/5/12/chartex" xmlns:cx7="http://schemas.microsoft.com/office/drawing/2016/5/13/chartex" xmlns:cx8="http://schemas.microsoft.com/office/drawing/2016/5/14/chartex" xmlns:mc="http://schemas.openxmlformats.org/markup-compatibility/2006" xmlns:aink="http://schemas.microsoft.com/office/drawing/2016/ink" xmlns:am3d="http://schemas.microsoft.com/office/drawing/2017/model3d" xmlns:o="urn:schemas-microsoft-com:office:office" xmlns:oel="http://schemas.microsoft.com/office/2019/extlst" xmlns:r="http://schemas.openxmlformats.org/officeDocument/2006/relationships" xmlns:m="http://schemas.openxmlformats.org/officeDocument/2006/math" xmlns:v="urn:schemas-microsoft-com:vml" xmlns:wp14="http://schemas.microsoft.com/office/word/2010/wordprocessingDrawing" xmlns:wp="http://schemas.openxmlformats.org/drawingml/2006/wordprocessingDrawing" xmlns:w10="urn:schemas-microsoft-com:office:word" xmlns:w="http://schemas.openxmlformats.org/wordprocessingml/2006/main" xmlns:w14="http://schemas.microsoft.com/office/word/2010/wordml" xmlns:w15="http://schemas.microsoft.com/office/word/2012/wordml" xmlns:w16cex="http://schemas.microsoft.com/office/word/2018/wordml/cex" xmlns:w16cid="http://schemas.microsoft.com/office/word/2016/wordml/cid" xmlns:w16="http://schemas.microsoft.com/office/word/2018/wordml" xmlns:w16du="http://schemas.microsoft.com/office/word/2023/wordml/word16du" xmlns:w16sdtdh="http://schemas.microsoft.com/office/word/2020/wordml/sdtdatahash" xmlns:w16sdtfl="http://schemas.microsoft.com/office/word/2024/wordml/sdtformatlock" xmlns:w16se="http://schemas.microsoft.com/office/word/2015/wordml/symex" xmlns:wpg="http://schemas.microsoft.com/office/word/2010/wordprocessingGroup" xmlns:wpi="http://schemas.microsoft.com/office/word/2010/wordprocessingInk" xmlns:wne="http://schemas.microsoft.com/office/word/2006/wordml" xmlns:wps="http://schemas.microsoft.com/office/word/2010/wordprocessingShape" mc:Ignorable="w14 w15 w16se w16cid w16 w16cex w16sdtdh w16sdtfl w16du wp14">
   <w:footnote w:type="separator" w:id="-1">
     <w:p>
       <w:r>
@@ -1255,7 +1525,7 @@
 </file>
 
 <file path=word/header1.xml><?xml version="1.0" encoding="utf-8"?>
-<w:hdr xmlns:wpc="http://schemas.microsoft.com/office/word/2010/wordprocessingCanvas" xmlns:cx="http://schemas.microsoft.com/office/drawing/2014/chartex" xmlns:cx1="http://schemas.microsoft.com/office/drawing/2015/9/8/chartex" xmlns:cx2="http://schemas.microsoft.com/office/drawing/2015/10/21/chartex" xmlns:cx3="http://schemas.microsoft.com/office/drawing/2016/5/9/chartex" xmlns:cx4="http://schemas.microsoft.com/office/drawing/2016/5/10/chartex" xmlns:cx5="http://schemas.microsoft.com/office/drawing/2016/5/11/chartex" xmlns:cx6="http://schemas.microsoft.com/office/drawing/2016/5/12/chartex" xmlns:cx7="http://schemas.microsoft.com/office/drawing/2016/5/13/chartex" xmlns:cx8="http://schemas.microsoft.com/office/drawing/2016/5/14/chartex" xmlns:mc="http://schemas.openxmlformats.org/markup-compatibility/2006" xmlns:m="http://schemas.openxmlformats.org/officeDocument/2006/math" xmlns:aink="http://schemas.microsoft.com/office/drawing/2016/ink" xmlns:am3d="http://schemas.microsoft.com/office/drawing/2017/model3d" xmlns:oel="http://schemas.microsoft.com/office/2019/extlst" xmlns:r="http://schemas.openxmlformats.org/officeDocument/2006/relationships" xmlns:wp14="http://schemas.microsoft.com/office/word/2010/wordprocessingDrawing" xmlns:wp="http://schemas.openxmlformats.org/drawingml/2006/wordprocessingDrawing" xmlns:wpg="http://schemas.microsoft.com/office/word/2010/wordprocessingGroup" xmlns:wpi="http://schemas.microsoft.com/office/word/2010/wordprocessingInk" xmlns:wps="http://schemas.microsoft.com/office/word/2010/wordprocessingShape" xmlns:o="urn:schemas-microsoft-com:office:office" xmlns:v="urn:schemas-microsoft-com:vml" xmlns:w10="urn:schemas-microsoft-com:office:word" xmlns:w="http://schemas.openxmlformats.org/wordprocessingml/2006/main" xmlns:w14="http://schemas.microsoft.com/office/word/2010/wordml" xmlns:w15="http://schemas.microsoft.com/office/word/2012/wordml" xmlns:w16cei="http://schemas.microsoft.com/office/word/2026/wordml/cei" xmlns:w16cex="http://schemas.microsoft.com/office/word/2018/wordml/cex" xmlns:w16cid="http://schemas.microsoft.com/office/word/2016/wordml/cid" xmlns:w16="http://schemas.microsoft.com/office/word/2018/wordml" xmlns:w16sdtdh="http://schemas.microsoft.com/office/word/2020/wordml/sdtdatahash" xmlns:w16sdtfl="http://schemas.microsoft.com/office/word/2024/wordml/sdtformatlock" xmlns:w16se="http://schemas.microsoft.com/office/word/2015/wordml/symex" xmlns:w16du="http://schemas.microsoft.com/office/word/2023/wordml/word16du" xmlns:wne="http://schemas.microsoft.com/office/word/2006/wordml" mc:Ignorable="w14 w15 w16se w16cid w16 w16cex w16sdtdh w16sdtfl w16du wp14">
+<w:hdr xmlns:wpc="http://schemas.microsoft.com/office/word/2010/wordprocessingCanvas" xmlns:cx="http://schemas.microsoft.com/office/drawing/2014/chartex" xmlns:cx1="http://schemas.microsoft.com/office/drawing/2015/9/8/chartex" xmlns:cx2="http://schemas.microsoft.com/office/drawing/2015/10/21/chartex" xmlns:cx3="http://schemas.microsoft.com/office/drawing/2016/5/9/chartex" xmlns:cx4="http://schemas.microsoft.com/office/drawing/2016/5/10/chartex" xmlns:cx5="http://schemas.microsoft.com/office/drawing/2016/5/11/chartex" xmlns:cx6="http://schemas.microsoft.com/office/drawing/2016/5/12/chartex" xmlns:cx7="http://schemas.microsoft.com/office/drawing/2016/5/13/chartex" xmlns:cx8="http://schemas.microsoft.com/office/drawing/2016/5/14/chartex" xmlns:mc="http://schemas.openxmlformats.org/markup-compatibility/2006" xmlns:aink="http://schemas.microsoft.com/office/drawing/2016/ink" xmlns:am3d="http://schemas.microsoft.com/office/drawing/2017/model3d" xmlns:o="urn:schemas-microsoft-com:office:office" xmlns:oel="http://schemas.microsoft.com/office/2019/extlst" xmlns:r="http://schemas.openxmlformats.org/officeDocument/2006/relationships" xmlns:m="http://schemas.openxmlformats.org/officeDocument/2006/math" xmlns:v="urn:schemas-microsoft-com:vml" xmlns:wp14="http://schemas.microsoft.com/office/word/2010/wordprocessingDrawing" xmlns:wp="http://schemas.openxmlformats.org/drawingml/2006/wordprocessingDrawing" xmlns:w10="urn:schemas-microsoft-com:office:word" xmlns:w="http://schemas.openxmlformats.org/wordprocessingml/2006/main" xmlns:w14="http://schemas.microsoft.com/office/word/2010/wordml" xmlns:w15="http://schemas.microsoft.com/office/word/2012/wordml" xmlns:w16cex="http://schemas.microsoft.com/office/word/2018/wordml/cex" xmlns:w16cid="http://schemas.microsoft.com/office/word/2016/wordml/cid" xmlns:w16="http://schemas.microsoft.com/office/word/2018/wordml" xmlns:w16du="http://schemas.microsoft.com/office/word/2023/wordml/word16du" xmlns:w16sdtdh="http://schemas.microsoft.com/office/word/2020/wordml/sdtdatahash" xmlns:w16sdtfl="http://schemas.microsoft.com/office/word/2024/wordml/sdtformatlock" xmlns:w16se="http://schemas.microsoft.com/office/word/2015/wordml/symex" xmlns:wpg="http://schemas.microsoft.com/office/word/2010/wordprocessingGroup" xmlns:wpi="http://schemas.microsoft.com/office/word/2010/wordprocessingInk" xmlns:wne="http://schemas.microsoft.com/office/word/2006/wordml" xmlns:wps="http://schemas.microsoft.com/office/word/2010/wordprocessingShape" mc:Ignorable="w14 w15 w16se w16cid w16 w16cex w16sdtdh w16sdtfl w16du wp14">
   <w:p>
     <w:pPr>
       <w:pStyle w:val="Header"/>
@@ -1268,8 +1538,16 @@
 </w:hdr>
 </file>
 
+<file path=word/people.xml><?xml version="1.0" encoding="utf-8"?>
+<w15:people xmlns:wpc="http://schemas.microsoft.com/office/word/2010/wordprocessingCanvas" xmlns:cx="http://schemas.microsoft.com/office/drawing/2014/chartex" xmlns:cx1="http://schemas.microsoft.com/office/drawing/2015/9/8/chartex" xmlns:cx2="http://schemas.microsoft.com/office/drawing/2015/10/21/chartex" xmlns:cx3="http://schemas.microsoft.com/office/drawing/2016/5/9/chartex" xmlns:cx4="http://schemas.microsoft.com/office/drawing/2016/5/10/chartex" xmlns:cx5="http://schemas.microsoft.com/office/drawing/2016/5/11/chartex" xmlns:cx6="http://schemas.microsoft.com/office/drawing/2016/5/12/chartex" xmlns:cx7="http://schemas.microsoft.com/office/drawing/2016/5/13/chartex" xmlns:cx8="http://schemas.microsoft.com/office/drawing/2016/5/14/chartex" xmlns:mc="http://schemas.openxmlformats.org/markup-compatibility/2006" xmlns:aink="http://schemas.microsoft.com/office/drawing/2016/ink" xmlns:am3d="http://schemas.microsoft.com/office/drawing/2017/model3d" xmlns:o="urn:schemas-microsoft-com:office:office" xmlns:oel="http://schemas.microsoft.com/office/2019/extlst" xmlns:r="http://schemas.openxmlformats.org/officeDocument/2006/relationships" xmlns:m="http://schemas.openxmlformats.org/officeDocument/2006/math" xmlns:v="urn:schemas-microsoft-com:vml" xmlns:wp14="http://schemas.microsoft.com/office/word/2010/wordprocessingDrawing" xmlns:wp="http://schemas.openxmlformats.org/drawingml/2006/wordprocessingDrawing" xmlns:w10="urn:schemas-microsoft-com:office:word" xmlns:w="http://schemas.openxmlformats.org/wordprocessingml/2006/main" xmlns:w14="http://schemas.microsoft.com/office/word/2010/wordml" xmlns:w15="http://schemas.microsoft.com/office/word/2012/wordml" xmlns:w16cex="http://schemas.microsoft.com/office/word/2018/wordml/cex" xmlns:w16cid="http://schemas.microsoft.com/office/word/2016/wordml/cid" xmlns:w16="http://schemas.microsoft.com/office/word/2018/wordml" xmlns:w16du="http://schemas.microsoft.com/office/word/2023/wordml/word16du" xmlns:w16sdtdh="http://schemas.microsoft.com/office/word/2020/wordml/sdtdatahash" xmlns:w16sdtfl="http://schemas.microsoft.com/office/word/2024/wordml/sdtformatlock" xmlns:w16se="http://schemas.microsoft.com/office/word/2015/wordml/symex" xmlns:wpg="http://schemas.microsoft.com/office/word/2010/wordprocessingGroup" xmlns:wpi="http://schemas.microsoft.com/office/word/2010/wordprocessingInk" xmlns:wne="http://schemas.microsoft.com/office/word/2006/wordml" xmlns:wps="http://schemas.microsoft.com/office/word/2010/wordprocessingShape" mc:Ignorable="w14 w15 w16se w16cid w16 w16cex w16sdtdh w16sdtfl w16du wp14">
+  <w15:person w15:author="Khandelwal, Amit">
+    <w15:presenceInfo w15:providerId="AD" w15:userId="S::amit.khandelwal@yale.edu::0b08a9c9-00a1-4b2c-acf6-acf764319c75"/>
+  </w15:person>
+</w15:people>
+</file>
+
 <file path=word/styles.xml><?xml version="1.0" encoding="utf-8"?>
-<w:styles xmlns:mc="http://schemas.openxmlformats.org/markup-compatibility/2006" xmlns:r="http://schemas.openxmlformats.org/officeDocument/2006/relationships" xmlns:w="http://schemas.openxmlformats.org/wordprocessingml/2006/main" xmlns:w14="http://schemas.microsoft.com/office/word/2010/wordml" xmlns:w15="http://schemas.microsoft.com/office/word/2012/wordml" xmlns:w16cex="http://schemas.microsoft.com/office/word/2018/wordml/cex" xmlns:w16cid="http://schemas.microsoft.com/office/word/2016/wordml/cid" xmlns:w16="http://schemas.microsoft.com/office/word/2018/wordml" xmlns:w16sdtdh="http://schemas.microsoft.com/office/word/2020/wordml/sdtdatahash" xmlns:w16sdtfl="http://schemas.microsoft.com/office/word/2024/wordml/sdtformatlock" xmlns:w16se="http://schemas.microsoft.com/office/word/2015/wordml/symex" xmlns:w16du="http://schemas.microsoft.com/office/word/2023/wordml/word16du" mc:Ignorable="w14 w15 w16se w16cid w16 w16cex w16sdtdh w16sdtfl w16du">
+<w:styles xmlns:mc="http://schemas.openxmlformats.org/markup-compatibility/2006" xmlns:r="http://schemas.openxmlformats.org/officeDocument/2006/relationships" xmlns:w="http://schemas.openxmlformats.org/wordprocessingml/2006/main" xmlns:w14="http://schemas.microsoft.com/office/word/2010/wordml" xmlns:w15="http://schemas.microsoft.com/office/word/2012/wordml" xmlns:w16cex="http://schemas.microsoft.com/office/word/2018/wordml/cex" xmlns:w16cid="http://schemas.microsoft.com/office/word/2016/wordml/cid" xmlns:w16="http://schemas.microsoft.com/office/word/2018/wordml" xmlns:w16du="http://schemas.microsoft.com/office/word/2023/wordml/word16du" xmlns:w16sdtdh="http://schemas.microsoft.com/office/word/2020/wordml/sdtdatahash" xmlns:w16sdtfl="http://schemas.microsoft.com/office/word/2024/wordml/sdtformatlock" xmlns:w16se="http://schemas.microsoft.com/office/word/2015/wordml/symex" mc:Ignorable="w14 w15 w16se w16cid w16 w16cex w16sdtdh w16sdtfl w16du">
   <w:docDefaults>
     <w:rPrDefault>
       <w:rPr>
@@ -1923,6 +2201,81 @@
       <w:bCs/>
     </w:rPr>
   </w:style>
+  <w:style w:type="paragraph" w:styleId="Revision">
+    <w:name w:val="Revision"/>
+    <w:hidden/>
+    <w:uiPriority w:val="99"/>
+    <w:semiHidden/>
+    <w:rsid w:val="00CF6449"/>
+    <w:rPr>
+      <w:sz w:val="24"/>
+      <w:szCs w:val="24"/>
+      <w:lang w:eastAsia="ar-SA"/>
+    </w:rPr>
+  </w:style>
+  <w:style w:type="character" w:styleId="CommentReference">
+    <w:name w:val="annotation reference"/>
+    <w:basedOn w:val="DefaultParagraphFont"/>
+    <w:uiPriority w:val="99"/>
+    <w:semiHidden/>
+    <w:unhideWhenUsed/>
+    <w:rsid w:val="00CF6449"/>
+    <w:rPr>
+      <w:sz w:val="16"/>
+      <w:szCs w:val="16"/>
+    </w:rPr>
+  </w:style>
+  <w:style w:type="paragraph" w:styleId="CommentText">
+    <w:name w:val="annotation text"/>
+    <w:basedOn w:val="Normal"/>
+    <w:link w:val="CommentTextChar"/>
+    <w:uiPriority w:val="99"/>
+    <w:semiHidden/>
+    <w:unhideWhenUsed/>
+    <w:rsid w:val="00CF6449"/>
+    <w:rPr>
+      <w:sz w:val="20"/>
+      <w:szCs w:val="20"/>
+    </w:rPr>
+  </w:style>
+  <w:style w:type="character" w:customStyle="1" w:styleId="CommentTextChar">
+    <w:name w:val="Comment Text Char"/>
+    <w:basedOn w:val="DefaultParagraphFont"/>
+    <w:link w:val="CommentText"/>
+    <w:uiPriority w:val="99"/>
+    <w:semiHidden/>
+    <w:rsid w:val="00CF6449"/>
+    <w:rPr>
+      <w:lang w:eastAsia="ar-SA"/>
+    </w:rPr>
+  </w:style>
+  <w:style w:type="paragraph" w:styleId="CommentSubject">
+    <w:name w:val="annotation subject"/>
+    <w:basedOn w:val="CommentText"/>
+    <w:next w:val="CommentText"/>
+    <w:link w:val="CommentSubjectChar"/>
+    <w:uiPriority w:val="99"/>
+    <w:semiHidden/>
+    <w:unhideWhenUsed/>
+    <w:rsid w:val="00CF6449"/>
+    <w:rPr>
+      <w:b/>
+      <w:bCs/>
+    </w:rPr>
+  </w:style>
+  <w:style w:type="character" w:customStyle="1" w:styleId="CommentSubjectChar">
+    <w:name w:val="Comment Subject Char"/>
+    <w:basedOn w:val="CommentTextChar"/>
+    <w:link w:val="CommentSubject"/>
+    <w:uiPriority w:val="99"/>
+    <w:semiHidden/>
+    <w:rsid w:val="00CF6449"/>
+    <w:rPr>
+      <w:b/>
+      <w:bCs/>
+      <w:lang w:eastAsia="ar-SA"/>
+    </w:rPr>
+  </w:style>
 </w:styles>
 </file>
 
@@ -2188,6 +2541,21 @@
 </file>
 
 <file path=customXml/item1.xml><?xml version="1.0" encoding="utf-8"?>
+<p:properties xmlns:p="http://schemas.microsoft.com/office/2006/metadata/properties" xmlns:xsi="http://www.w3.org/2001/XMLSchema-instance" xmlns:pc="http://schemas.microsoft.com/office/infopath/2007/PartnerControls">
+  <documentManagement/>
+</p:properties>
+</file>
+
+<file path=customXml/item2.xml><?xml version="1.0" encoding="utf-8"?>
+<?mso-contentType ?>
+<FormTemplates xmlns="http://schemas.microsoft.com/sharepoint/v3/contenttype/forms">
+  <Display>DocumentLibraryForm</Display>
+  <Edit>DocumentLibraryForm</Edit>
+  <New>DocumentLibraryForm</New>
+</FormTemplates>
+</file>
+
+<file path=customXml/item3.xml><?xml version="1.0" encoding="utf-8"?>
 <ct:contentTypeSchema xmlns:ct="http://schemas.microsoft.com/office/2006/metadata/contentType" xmlns:ma="http://schemas.microsoft.com/office/2006/metadata/properties/metaAttributes" ct:_="" ma:_="" ma:contentTypeName="Document" ma:contentTypeID="0x01010007FC644F770EBB4593783ED8D49DD1E9" ma:contentTypeVersion="0" ma:contentTypeDescription="Create a new document." ma:contentTypeScope="" ma:versionID="3080d9b11825addb7e1a7356b8c375ef">
   <xsd:schema xmlns:xsd="http://www.w3.org/2001/XMLSchema" xmlns:xs="http://www.w3.org/2001/XMLSchema" xmlns:p="http://schemas.microsoft.com/office/2006/metadata/properties" targetNamespace="http://schemas.microsoft.com/office/2006/metadata/properties" ma:root="true" ma:fieldsID="500c6692915ba10984c0aabd49f31b22">
     <xsd:element name="properties">
@@ -2301,32 +2669,10 @@
 </ct:contentTypeSchema>
 </file>
 
-<file path=customXml/item2.xml><?xml version="1.0" encoding="utf-8"?>
-<?mso-contentType ?>
-<FormTemplates xmlns="http://schemas.microsoft.com/sharepoint/v3/contenttype/forms">
-  <Display>DocumentLibraryForm</Display>
-  <Edit>DocumentLibraryForm</Edit>
-  <New>DocumentLibraryForm</New>
-</FormTemplates>
-</file>
-
-<file path=customXml/item3.xml><?xml version="1.0" encoding="utf-8"?>
-<p:properties xmlns:p="http://schemas.microsoft.com/office/2006/metadata/properties" xmlns:xsi="http://www.w3.org/2001/XMLSchema-instance" xmlns:pc="http://schemas.microsoft.com/office/infopath/2007/PartnerControls">
-  <documentManagement/>
-</p:properties>
-</file>
-
 <file path=customXml/itemProps1.xml><?xml version="1.0" encoding="utf-8"?>
-<ds:datastoreItem xmlns:ds="http://schemas.openxmlformats.org/officeDocument/2006/customXml" ds:itemID="{B636C937-F529-4C3E-AE48-ABCDC19C7117}">
+<ds:datastoreItem xmlns:ds="http://schemas.openxmlformats.org/officeDocument/2006/customXml" ds:itemID="{D0124FFD-1CE1-4B77-84DE-59500854D475}">
   <ds:schemaRefs>
-    <ds:schemaRef ds:uri="http://schemas.microsoft.com/office/2006/metadata/contentType"/>
-    <ds:schemaRef ds:uri="http://schemas.microsoft.com/office/2006/metadata/properties/metaAttributes"/>
-    <ds:schemaRef ds:uri="http://www.w3.org/2001/XMLSchema"/>
     <ds:schemaRef ds:uri="http://schemas.microsoft.com/office/2006/metadata/properties"/>
-    <ds:schemaRef ds:uri="http://schemas.openxmlformats.org/package/2006/metadata/core-properties"/>
-    <ds:schemaRef ds:uri="http://purl.org/dc/elements/1.1/"/>
-    <ds:schemaRef ds:uri="http://purl.org/dc/terms/"/>
-    <ds:schemaRef ds:uri="http://schemas.microsoft.com/internal/obd"/>
     <ds:schemaRef ds:uri="http://schemas.microsoft.com/office/infopath/2007/PartnerControls"/>
   </ds:schemaRefs>
 </ds:datastoreItem>
@@ -2341,9 +2687,16 @@
 </file>
 
 <file path=customXml/itemProps3.xml><?xml version="1.0" encoding="utf-8"?>
-<ds:datastoreItem xmlns:ds="http://schemas.openxmlformats.org/officeDocument/2006/customXml" ds:itemID="{D0124FFD-1CE1-4B77-84DE-59500854D475}">
+<ds:datastoreItem xmlns:ds="http://schemas.openxmlformats.org/officeDocument/2006/customXml" ds:itemID="{B636C937-F529-4C3E-AE48-ABCDC19C7117}">
   <ds:schemaRefs>
+    <ds:schemaRef ds:uri="http://schemas.microsoft.com/office/2006/metadata/contentType"/>
+    <ds:schemaRef ds:uri="http://schemas.microsoft.com/office/2006/metadata/properties/metaAttributes"/>
+    <ds:schemaRef ds:uri="http://www.w3.org/2001/XMLSchema"/>
     <ds:schemaRef ds:uri="http://schemas.microsoft.com/office/2006/metadata/properties"/>
+    <ds:schemaRef ds:uri="http://schemas.openxmlformats.org/package/2006/metadata/core-properties"/>
+    <ds:schemaRef ds:uri="http://purl.org/dc/elements/1.1/"/>
+    <ds:schemaRef ds:uri="http://purl.org/dc/terms/"/>
+    <ds:schemaRef ds:uri="http://schemas.microsoft.com/internal/obd"/>
     <ds:schemaRef ds:uri="http://schemas.microsoft.com/office/infopath/2007/PartnerControls"/>
   </ds:schemaRefs>
 </ds:datastoreItem>

</xml_diff>